<commit_message>
Fix template row loops, fix SUCCOR SIGEDO extraction, update batch script, and fix Oficios naming
</commit_message>
<xml_diff>
--- a/plantillas/plantilla_informe_multiple.docx
+++ b/plantillas/plantilla_informe_multiple.docx
@@ -1402,6 +1402,15 @@
         </w:tc>
       </w:tr>
       <w:tr>
+        <w:tc>
+          <w:p>
+            <w:r>
+              <w:t>{%tr for b in becarios %}</w:t>
+            </w:r>
+          </w:p>
+        </w:tc>
+      </w:tr>
+      <w:tr>
         <w:trPr>
           <w:trHeight w:val="427"/>
           <w:jc w:val="center"/>
@@ -1413,7 +1422,7 @@
           </w:tcPr>
           <w:p>
             <w:r>
-              <w:t>{% tr for b in becarios %}{{ loop.index }}</w:t>
+              <w:t>{{ loop.index }}</w:t>
             </w:r>
           </w:p>
         </w:tc>
@@ -1472,7 +1481,16 @@
           </w:tcPr>
           <w:p>
             <w:r>
-              <w:t>{{ b.CARRERA }}{% tr endfor %}</w:t>
+              <w:t>{{ b.CARRERA }}</w:t>
+            </w:r>
+          </w:p>
+        </w:tc>
+      </w:tr>
+      <w:tr>
+        <w:tc>
+          <w:p>
+            <w:r>
+              <w:t>{%tr endfor %}</w:t>
             </w:r>
           </w:p>
         </w:tc>
@@ -2835,6 +2853,15 @@
         </w:tc>
       </w:tr>
       <w:tr>
+        <w:tc>
+          <w:p>
+            <w:r>
+              <w:t>{%tr for b in becarios %}</w:t>
+            </w:r>
+          </w:p>
+        </w:tc>
+      </w:tr>
+      <w:tr>
         <w:trPr>
           <w:trHeight w:val="427"/>
           <w:jc w:val="center"/>
@@ -2846,7 +2873,7 @@
           </w:tcPr>
           <w:p>
             <w:r>
-              <w:t>{% tr for b in becarios %}{{ loop.index }}</w:t>
+              <w:t>{{ loop.index }}</w:t>
             </w:r>
           </w:p>
         </w:tc>
@@ -2890,7 +2917,16 @@
           </w:tcPr>
           <w:p>
             <w:r>
-              <w:t>{{ b.FECHA_FIN_SIBEC }}{% tr endfor %}</w:t>
+              <w:t>{{ b.FECHA_FIN_SIBEC }}</w:t>
+            </w:r>
+          </w:p>
+        </w:tc>
+      </w:tr>
+      <w:tr>
+        <w:tc>
+          <w:p>
+            <w:r>
+              <w:t>{%tr endfor %}</w:t>
             </w:r>
           </w:p>
         </w:tc>

</xml_diff>